<commit_message>
test: add points to question documents
</commit_message>
<xml_diff>
--- a/tests/fixtures/baza/pitanja/ndo/1.docx
+++ b/tests/fixtures/baza/pitanja/ndo/1.docx
@@ -144,8 +144,21 @@
                 <w:b/>
                 <w:sz w:val="28"/>
                 <w:szCs w:val="28"/>
+                <w:lang w:val="sr-Latn-BA"/>
               </w:rPr>
             </w:pPr>
+            <w:r>
+              <w:rPr>
+                <w:rFonts w:ascii="Arial" w:hAnsi="Arial" w:cs="Arial"/>
+                <w:b/>
+                <w:sz w:val="28"/>
+                <w:szCs w:val="28"/>
+                <w:lang w:val="sr-Latn-BA"/>
+              </w:rPr>
+              <w:t>1</w:t>
+            </w:r>
+            <w:bookmarkStart w:id="3" w:name="_GoBack"/>
+            <w:bookmarkEnd w:id="3"/>
           </w:p>
         </w:tc>
       </w:tr>
@@ -565,8 +578,6 @@
           <w:lang w:val="sr-Latn-BA"/>
         </w:rPr>
       </w:pPr>
-      <w:bookmarkStart w:id="3" w:name="_GoBack"/>
-      <w:bookmarkEnd w:id="3"/>
     </w:p>
     <w:bookmarkEnd w:id="0"/>
     <w:bookmarkEnd w:id="1"/>
@@ -700,7 +711,7 @@
                 </wp:anchor>
               </w:drawing>
             </mc:Choice>
-            <mc:Fallback xmlns:w16sdtdh="http://schemas.microsoft.com/office/word/2020/wordml/sdtdatahash" xmlns:w16="http://schemas.microsoft.com/office/word/2018/wordml" xmlns:w16cid="http://schemas.microsoft.com/office/word/2016/wordml/cid" xmlns:w16cex="http://schemas.microsoft.com/office/word/2018/wordml/cex" xmlns:oel="http://schemas.microsoft.com/office/2019/extlst" xmlns:am3d="http://schemas.microsoft.com/office/drawing/2017/model3d" xmlns:aink="http://schemas.microsoft.com/office/drawing/2016/ink" xmlns:cx8="http://schemas.microsoft.com/office/drawing/2016/5/14/chartex" xmlns:cx7="http://schemas.microsoft.com/office/drawing/2016/5/13/chartex" xmlns:cx6="http://schemas.microsoft.com/office/drawing/2016/5/12/chartex" xmlns:cx5="http://schemas.microsoft.com/office/drawing/2016/5/11/chartex" xmlns:cx4="http://schemas.microsoft.com/office/drawing/2016/5/10/chartex" xmlns:cx3="http://schemas.microsoft.com/office/drawing/2016/5/9/chartex" xmlns:cx2="http://schemas.microsoft.com/office/drawing/2015/10/21/chartex" xmlns:cx1="http://schemas.microsoft.com/office/drawing/2015/9/8/chartex">
+            <mc:Fallback xmlns:cx1="http://schemas.microsoft.com/office/drawing/2015/9/8/chartex" xmlns:cx2="http://schemas.microsoft.com/office/drawing/2015/10/21/chartex" xmlns:cx3="http://schemas.microsoft.com/office/drawing/2016/5/9/chartex" xmlns:cx4="http://schemas.microsoft.com/office/drawing/2016/5/10/chartex" xmlns:cx5="http://schemas.microsoft.com/office/drawing/2016/5/11/chartex" xmlns:cx6="http://schemas.microsoft.com/office/drawing/2016/5/12/chartex" xmlns:cx7="http://schemas.microsoft.com/office/drawing/2016/5/13/chartex" xmlns:cx8="http://schemas.microsoft.com/office/drawing/2016/5/14/chartex" xmlns:aink="http://schemas.microsoft.com/office/drawing/2016/ink" xmlns:am3d="http://schemas.microsoft.com/office/drawing/2017/model3d" xmlns:oel="http://schemas.microsoft.com/office/2019/extlst" xmlns:w16cex="http://schemas.microsoft.com/office/word/2018/wordml/cex" xmlns:w16cid="http://schemas.microsoft.com/office/word/2016/wordml/cid" xmlns:w16="http://schemas.microsoft.com/office/word/2018/wordml" xmlns:w16sdtdh="http://schemas.microsoft.com/office/word/2020/wordml/sdtdatahash">
               <w:pict>
                 <v:line w14:anchorId="2ACA85AB" id="Straight Connector 5" o:spid="_x0000_s1026" style="position:absolute;flip:y;z-index:251662336;visibility:visible;mso-wrap-style:square;mso-width-percent:0;mso-height-percent:0;mso-wrap-distance-left:9pt;mso-wrap-distance-top:0;mso-wrap-distance-right:9pt;mso-wrap-distance-bottom:0;mso-position-horizontal:absolute;mso-position-horizontal-relative:margin;mso-position-vertical:absolute;mso-position-vertical-relative:text;mso-width-percent:0;mso-height-percent:0;mso-width-relative:page;mso-height-relative:page" from="-21.9pt,-1.5pt" to="472.9pt,-1.1pt" o:gfxdata="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" strokecolor="black [3200]" strokeweight="1pt">
                   <v:stroke joinstyle="miter"/>
@@ -17212,7 +17223,7 @@
 </file>
 
 <file path=customXml/itemProps1.xml><?xml version="1.0" encoding="utf-8"?>
-<ds:datastoreItem xmlns:ds="http://schemas.openxmlformats.org/officeDocument/2006/customXml" ds:itemID="{D86C7E40-7C56-456C-B9D5-816CF2CE3802}">
+<ds:datastoreItem xmlns:ds="http://schemas.openxmlformats.org/officeDocument/2006/customXml" ds:itemID="{ED177448-C5EC-45BD-9DE8-472D4AF1197D}">
   <ds:schemaRefs>
     <ds:schemaRef ds:uri="http://schemas.openxmlformats.org/officeDocument/2006/bibliography"/>
   </ds:schemaRefs>

</xml_diff>

<commit_message>
test: update question document fixtures
</commit_message>
<xml_diff>
--- a/tests/fixtures/baza/pitanja/ndo/1.docx
+++ b/tests/fixtures/baza/pitanja/ndo/1.docx
@@ -128,6 +128,18 @@
                 <w:szCs w:val="20"/>
               </w:rPr>
             </w:pPr>
+            <w:r>
+              <w:rPr>
+                <w:rFonts w:ascii="Arial" w:hAnsi="Arial" w:cs="Arial"/>
+                <w:b/>
+                <w:i/>
+                <w:sz w:val="20"/>
+                <w:szCs w:val="20"/>
+              </w:rPr>
+              <w:t>Максимално</w:t>
+            </w:r>
+            <w:bookmarkStart w:id="3" w:name="_GoBack"/>
+            <w:bookmarkEnd w:id="3"/>
           </w:p>
         </w:tc>
         <w:tc>
@@ -157,8 +169,6 @@
               </w:rPr>
               <w:t>1</w:t>
             </w:r>
-            <w:bookmarkStart w:id="3" w:name="_GoBack"/>
-            <w:bookmarkEnd w:id="3"/>
           </w:p>
         </w:tc>
       </w:tr>
@@ -711,7 +721,7 @@
                 </wp:anchor>
               </w:drawing>
             </mc:Choice>
-            <mc:Fallback xmlns:cx1="http://schemas.microsoft.com/office/drawing/2015/9/8/chartex" xmlns:cx2="http://schemas.microsoft.com/office/drawing/2015/10/21/chartex" xmlns:cx3="http://schemas.microsoft.com/office/drawing/2016/5/9/chartex" xmlns:cx4="http://schemas.microsoft.com/office/drawing/2016/5/10/chartex" xmlns:cx5="http://schemas.microsoft.com/office/drawing/2016/5/11/chartex" xmlns:cx6="http://schemas.microsoft.com/office/drawing/2016/5/12/chartex" xmlns:cx7="http://schemas.microsoft.com/office/drawing/2016/5/13/chartex" xmlns:cx8="http://schemas.microsoft.com/office/drawing/2016/5/14/chartex" xmlns:aink="http://schemas.microsoft.com/office/drawing/2016/ink" xmlns:am3d="http://schemas.microsoft.com/office/drawing/2017/model3d" xmlns:oel="http://schemas.microsoft.com/office/2019/extlst" xmlns:w16cex="http://schemas.microsoft.com/office/word/2018/wordml/cex" xmlns:w16cid="http://schemas.microsoft.com/office/word/2016/wordml/cid" xmlns:w16="http://schemas.microsoft.com/office/word/2018/wordml" xmlns:w16sdtdh="http://schemas.microsoft.com/office/word/2020/wordml/sdtdatahash">
+            <mc:Fallback xmlns:w16sdtdh="http://schemas.microsoft.com/office/word/2020/wordml/sdtdatahash" xmlns:w16="http://schemas.microsoft.com/office/word/2018/wordml" xmlns:w16cid="http://schemas.microsoft.com/office/word/2016/wordml/cid" xmlns:w16cex="http://schemas.microsoft.com/office/word/2018/wordml/cex" xmlns:oel="http://schemas.microsoft.com/office/2019/extlst" xmlns:am3d="http://schemas.microsoft.com/office/drawing/2017/model3d" xmlns:aink="http://schemas.microsoft.com/office/drawing/2016/ink" xmlns:cx8="http://schemas.microsoft.com/office/drawing/2016/5/14/chartex" xmlns:cx7="http://schemas.microsoft.com/office/drawing/2016/5/13/chartex" xmlns:cx6="http://schemas.microsoft.com/office/drawing/2016/5/12/chartex" xmlns:cx5="http://schemas.microsoft.com/office/drawing/2016/5/11/chartex" xmlns:cx4="http://schemas.microsoft.com/office/drawing/2016/5/10/chartex" xmlns:cx3="http://schemas.microsoft.com/office/drawing/2016/5/9/chartex" xmlns:cx2="http://schemas.microsoft.com/office/drawing/2015/10/21/chartex" xmlns:cx1="http://schemas.microsoft.com/office/drawing/2015/9/8/chartex">
               <w:pict>
                 <v:line w14:anchorId="2ACA85AB" id="Straight Connector 5" o:spid="_x0000_s1026" style="position:absolute;flip:y;z-index:251662336;visibility:visible;mso-wrap-style:square;mso-width-percent:0;mso-height-percent:0;mso-wrap-distance-left:9pt;mso-wrap-distance-top:0;mso-wrap-distance-right:9pt;mso-wrap-distance-bottom:0;mso-position-horizontal:absolute;mso-position-horizontal-relative:margin;mso-position-vertical:absolute;mso-position-vertical-relative:text;mso-width-percent:0;mso-height-percent:0;mso-width-relative:page;mso-height-relative:page" from="-21.9pt,-1.5pt" to="472.9pt,-1.1pt" o:gfxdata="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" strokecolor="black [3200]" strokeweight="1pt">
                   <v:stroke joinstyle="miter"/>
@@ -17223,7 +17233,7 @@
 </file>
 
 <file path=customXml/itemProps1.xml><?xml version="1.0" encoding="utf-8"?>
-<ds:datastoreItem xmlns:ds="http://schemas.openxmlformats.org/officeDocument/2006/customXml" ds:itemID="{ED177448-C5EC-45BD-9DE8-472D4AF1197D}">
+<ds:datastoreItem xmlns:ds="http://schemas.openxmlformats.org/officeDocument/2006/customXml" ds:itemID="{84F4ECA8-A6FC-4BE6-ABE8-61236DAF48B0}">
   <ds:schemaRefs>
     <ds:schemaRef ds:uri="http://schemas.openxmlformats.org/officeDocument/2006/bibliography"/>
   </ds:schemaRefs>

</xml_diff>